<commit_message>
Atualização do documento técnico
</commit_message>
<xml_diff>
--- a/documentacao/DOCUMENTO TÉCNICO.docx
+++ b/documentacao/DOCUMENTO TÉCNICO.docx
@@ -336,7 +336,27 @@
           <w:szCs w:val="24"/>
           <w:lang w:eastAsia="pt-BR"/>
         </w:rPr>
-        <w:t>Brasília, Maio/2026</w:t>
+        <w:t xml:space="preserve">Brasília, </w:t>
+      </w:r>
+      <w:proofErr w:type="gramStart"/>
+      <w:r>
+        <w:rPr>
+          <w:rFonts w:ascii="Arial" w:eastAsia="Times New Roman" w:hAnsi="Arial" w:cs="Arial"/>
+          <w:sz w:val="24"/>
+          <w:szCs w:val="24"/>
+          <w:lang w:eastAsia="pt-BR"/>
+        </w:rPr>
+        <w:t>Maio</w:t>
+      </w:r>
+      <w:proofErr w:type="gramEnd"/>
+      <w:r>
+        <w:rPr>
+          <w:rFonts w:ascii="Arial" w:eastAsia="Times New Roman" w:hAnsi="Arial" w:cs="Arial"/>
+          <w:sz w:val="24"/>
+          <w:szCs w:val="24"/>
+          <w:lang w:eastAsia="pt-BR"/>
+        </w:rPr>
+        <w:t>/2026</w:t>
       </w:r>
     </w:p>
     <w:p>
@@ -395,16 +415,7 @@
           <w:szCs w:val="24"/>
           <w:lang w:eastAsia="pt-BR"/>
         </w:rPr>
-        <w:t xml:space="preserve">Curso de </w:t>
-      </w:r>
-      <w:r>
-        <w:rPr>
-          <w:rFonts w:ascii="Arial" w:eastAsia="Times New Roman" w:hAnsi="Arial" w:cs="Arial"/>
-          <w:sz w:val="24"/>
-          <w:szCs w:val="24"/>
-          <w:lang w:eastAsia="pt-BR"/>
-        </w:rPr>
-        <w:t>Análise e Desenvolvimento de Sistemas</w:t>
+        <w:t>Curso de Análise e Desenvolvimento de Sistemas</w:t>
       </w:r>
       <w:r>
         <w:rPr>
@@ -480,14 +491,25 @@
           <w:lang w:eastAsia="pt-BR"/>
         </w:rPr>
       </w:pPr>
-      <w:r>
-        <w:rPr>
-          <w:rFonts w:ascii="Arial" w:eastAsia="Times New Roman" w:hAnsi="Arial" w:cs="Arial"/>
-          <w:sz w:val="24"/>
-          <w:szCs w:val="24"/>
-          <w:lang w:eastAsia="pt-BR"/>
-        </w:rPr>
-        <w:t xml:space="preserve">Geovanna de Freitas </w:t>
+      <w:proofErr w:type="spellStart"/>
+      <w:r>
+        <w:rPr>
+          <w:rFonts w:ascii="Arial" w:eastAsia="Times New Roman" w:hAnsi="Arial" w:cs="Arial"/>
+          <w:sz w:val="24"/>
+          <w:szCs w:val="24"/>
+          <w:lang w:eastAsia="pt-BR"/>
+        </w:rPr>
+        <w:t>Geovanna</w:t>
+      </w:r>
+      <w:proofErr w:type="spellEnd"/>
+      <w:r>
+        <w:rPr>
+          <w:rFonts w:ascii="Arial" w:eastAsia="Times New Roman" w:hAnsi="Arial" w:cs="Arial"/>
+          <w:sz w:val="24"/>
+          <w:szCs w:val="24"/>
+          <w:lang w:eastAsia="pt-BR"/>
+        </w:rPr>
+        <w:t xml:space="preserve"> de Freitas </w:t>
       </w:r>
     </w:p>
     <w:p>
@@ -622,7 +644,27 @@
           <w:szCs w:val="24"/>
           <w:lang w:eastAsia="pt-BR"/>
         </w:rPr>
-        <w:t>O sistema foi idealizado para solucionar problemas identificados no funcionamento atual do food truck Iron Burguer, como a falta de controle dos pedidos, ausência de informações atualizadas sobre produtos disponíveis, erros em registros manuais e desorganização no fluxo de produção.</w:t>
+        <w:t xml:space="preserve">O sistema foi idealizado para solucionar problemas identificados no funcionamento atual do food </w:t>
+      </w:r>
+      <w:proofErr w:type="spellStart"/>
+      <w:r>
+        <w:rPr>
+          <w:rFonts w:ascii="Arial" w:eastAsia="Times New Roman" w:hAnsi="Arial" w:cs="Arial"/>
+          <w:sz w:val="24"/>
+          <w:szCs w:val="24"/>
+          <w:lang w:eastAsia="pt-BR"/>
+        </w:rPr>
+        <w:t>truck</w:t>
+      </w:r>
+      <w:proofErr w:type="spellEnd"/>
+      <w:r>
+        <w:rPr>
+          <w:rFonts w:ascii="Arial" w:eastAsia="Times New Roman" w:hAnsi="Arial" w:cs="Arial"/>
+          <w:sz w:val="24"/>
+          <w:szCs w:val="24"/>
+          <w:lang w:eastAsia="pt-BR"/>
+        </w:rPr>
+        <w:t xml:space="preserve"> Iron Burguer, como a falta de controle dos pedidos, ausência de informações atualizadas sobre produtos disponíveis, erros em registros manuais e desorganização no fluxo de produção.</w:t>
       </w:r>
     </w:p>
     <w:p>
@@ -988,7 +1030,27 @@
           <w:szCs w:val="24"/>
           <w:lang w:eastAsia="pt-BR"/>
         </w:rPr>
-        <w:t xml:space="preserve">Organização das tarefas no Kanban. </w:t>
+        <w:t xml:space="preserve">Organização das tarefas no </w:t>
+      </w:r>
+      <w:proofErr w:type="spellStart"/>
+      <w:r>
+        <w:rPr>
+          <w:rFonts w:ascii="Arial" w:eastAsia="Times New Roman" w:hAnsi="Arial" w:cs="Arial"/>
+          <w:sz w:val="24"/>
+          <w:szCs w:val="24"/>
+          <w:lang w:eastAsia="pt-BR"/>
+        </w:rPr>
+        <w:t>Kanban</w:t>
+      </w:r>
+      <w:proofErr w:type="spellEnd"/>
+      <w:r>
+        <w:rPr>
+          <w:rFonts w:ascii="Arial" w:eastAsia="Times New Roman" w:hAnsi="Arial" w:cs="Arial"/>
+          <w:sz w:val="24"/>
+          <w:szCs w:val="24"/>
+          <w:lang w:eastAsia="pt-BR"/>
+        </w:rPr>
+        <w:t xml:space="preserve">. </w:t>
       </w:r>
     </w:p>
     <w:p>
@@ -1071,7 +1133,47 @@
           <w:szCs w:val="24"/>
           <w:lang w:eastAsia="pt-BR"/>
         </w:rPr>
-        <w:t>O sistema utilizará a arquitetura MVC (Model-View-Controller), separando a aplicação em três camadas principais:</w:t>
+        <w:t>O sistema utilizará a arquitetura MVC (Model-</w:t>
+      </w:r>
+      <w:proofErr w:type="spellStart"/>
+      <w:r>
+        <w:rPr>
+          <w:rFonts w:ascii="Arial" w:eastAsia="Times New Roman" w:hAnsi="Arial" w:cs="Arial"/>
+          <w:sz w:val="24"/>
+          <w:szCs w:val="24"/>
+          <w:lang w:eastAsia="pt-BR"/>
+        </w:rPr>
+        <w:t>View</w:t>
+      </w:r>
+      <w:proofErr w:type="spellEnd"/>
+      <w:r>
+        <w:rPr>
+          <w:rFonts w:ascii="Arial" w:eastAsia="Times New Roman" w:hAnsi="Arial" w:cs="Arial"/>
+          <w:sz w:val="24"/>
+          <w:szCs w:val="24"/>
+          <w:lang w:eastAsia="pt-BR"/>
+        </w:rPr>
+        <w:t>-</w:t>
+      </w:r>
+      <w:proofErr w:type="spellStart"/>
+      <w:r>
+        <w:rPr>
+          <w:rFonts w:ascii="Arial" w:eastAsia="Times New Roman" w:hAnsi="Arial" w:cs="Arial"/>
+          <w:sz w:val="24"/>
+          <w:szCs w:val="24"/>
+          <w:lang w:eastAsia="pt-BR"/>
+        </w:rPr>
+        <w:t>Controller</w:t>
+      </w:r>
+      <w:proofErr w:type="spellEnd"/>
+      <w:r>
+        <w:rPr>
+          <w:rFonts w:ascii="Arial" w:eastAsia="Times New Roman" w:hAnsi="Arial" w:cs="Arial"/>
+          <w:sz w:val="24"/>
+          <w:szCs w:val="24"/>
+          <w:lang w:eastAsia="pt-BR"/>
+        </w:rPr>
+        <w:t>), separando a aplicação em três camadas principais:</w:t>
       </w:r>
     </w:p>
     <w:p>
@@ -1132,6 +1234,7 @@
           <w:lang w:eastAsia="pt-BR"/>
         </w:rPr>
       </w:pPr>
+      <w:proofErr w:type="spellStart"/>
       <w:r>
         <w:rPr>
           <w:rFonts w:ascii="Arial" w:eastAsia="Times New Roman" w:hAnsi="Arial" w:cs="Arial"/>
@@ -1143,6 +1246,7 @@
         </w:rPr>
         <w:t>View</w:t>
       </w:r>
+      <w:proofErr w:type="spellEnd"/>
     </w:p>
     <w:p>
       <w:pPr>
@@ -1177,6 +1281,7 @@
           <w:lang w:eastAsia="pt-BR"/>
         </w:rPr>
       </w:pPr>
+      <w:proofErr w:type="spellStart"/>
       <w:r>
         <w:rPr>
           <w:rFonts w:ascii="Arial" w:eastAsia="Times New Roman" w:hAnsi="Arial" w:cs="Arial"/>
@@ -1188,6 +1293,7 @@
         </w:rPr>
         <w:t>Controller</w:t>
       </w:r>
+      <w:proofErr w:type="spellEnd"/>
     </w:p>
     <w:p>
       <w:pPr>
@@ -1385,7 +1491,128 @@
           <w:szCs w:val="36"/>
           <w:lang w:eastAsia="pt-BR"/>
         </w:rPr>
-        <w:t>4.1 Front-end</w:t>
+        <w:t>4.1 Front-</w:t>
+      </w:r>
+      <w:proofErr w:type="spellStart"/>
+      <w:r>
+        <w:rPr>
+          <w:rFonts w:ascii="Arial" w:eastAsia="Times New Roman" w:hAnsi="Arial" w:cs="Arial"/>
+          <w:b/>
+          <w:bCs/>
+          <w:sz w:val="36"/>
+          <w:szCs w:val="36"/>
+          <w:lang w:eastAsia="pt-BR"/>
+        </w:rPr>
+        <w:t>end</w:t>
+      </w:r>
+      <w:proofErr w:type="spellEnd"/>
+    </w:p>
+    <w:p>
+      <w:pPr>
+        <w:pStyle w:val="PargrafodaLista"/>
+        <w:numPr>
+          <w:ilvl w:val="0"/>
+          <w:numId w:val="11"/>
+        </w:numPr>
+        <w:spacing w:before="100" w:beforeAutospacing="1" w:after="100" w:afterAutospacing="1" w:line="240" w:lineRule="auto"/>
+        <w:outlineLvl w:val="1"/>
+        <w:rPr>
+          <w:rFonts w:ascii="Arial" w:eastAsia="Times New Roman" w:hAnsi="Arial" w:cs="Arial"/>
+          <w:sz w:val="24"/>
+          <w:szCs w:val="24"/>
+          <w:lang w:eastAsia="pt-BR"/>
+        </w:rPr>
+      </w:pPr>
+      <w:r>
+        <w:rPr>
+          <w:rFonts w:ascii="Arial" w:eastAsia="Times New Roman" w:hAnsi="Arial" w:cs="Arial"/>
+          <w:sz w:val="24"/>
+          <w:szCs w:val="24"/>
+          <w:lang w:eastAsia="pt-BR"/>
+        </w:rPr>
+        <w:t>HTML</w:t>
+      </w:r>
+    </w:p>
+    <w:p>
+      <w:pPr>
+        <w:pStyle w:val="PargrafodaLista"/>
+        <w:numPr>
+          <w:ilvl w:val="0"/>
+          <w:numId w:val="11"/>
+        </w:numPr>
+        <w:spacing w:before="100" w:beforeAutospacing="1" w:after="100" w:afterAutospacing="1" w:line="240" w:lineRule="auto"/>
+        <w:outlineLvl w:val="1"/>
+        <w:rPr>
+          <w:rFonts w:ascii="Arial" w:eastAsia="Times New Roman" w:hAnsi="Arial" w:cs="Arial"/>
+          <w:sz w:val="24"/>
+          <w:szCs w:val="24"/>
+          <w:lang w:eastAsia="pt-BR"/>
+        </w:rPr>
+      </w:pPr>
+      <w:r>
+        <w:rPr>
+          <w:rFonts w:ascii="Arial" w:eastAsia="Times New Roman" w:hAnsi="Arial" w:cs="Arial"/>
+          <w:sz w:val="24"/>
+          <w:szCs w:val="24"/>
+          <w:lang w:eastAsia="pt-BR"/>
+        </w:rPr>
+        <w:t>CSS</w:t>
+      </w:r>
+    </w:p>
+    <w:p>
+      <w:pPr>
+        <w:pStyle w:val="PargrafodaLista"/>
+        <w:numPr>
+          <w:ilvl w:val="0"/>
+          <w:numId w:val="11"/>
+        </w:numPr>
+        <w:spacing w:before="100" w:beforeAutospacing="1" w:after="100" w:afterAutospacing="1" w:line="240" w:lineRule="auto"/>
+        <w:outlineLvl w:val="1"/>
+        <w:rPr>
+          <w:rFonts w:ascii="Arial" w:eastAsia="Times New Roman" w:hAnsi="Arial" w:cs="Arial"/>
+          <w:b/>
+          <w:bCs/>
+          <w:sz w:val="36"/>
+          <w:szCs w:val="36"/>
+          <w:lang w:eastAsia="pt-BR"/>
+        </w:rPr>
+      </w:pPr>
+      <w:proofErr w:type="spellStart"/>
+      <w:r>
+        <w:rPr>
+          <w:rFonts w:ascii="Arial" w:eastAsia="Times New Roman" w:hAnsi="Arial" w:cs="Arial"/>
+          <w:sz w:val="24"/>
+          <w:szCs w:val="24"/>
+          <w:lang w:eastAsia="pt-BR"/>
+        </w:rPr>
+        <w:t>JavaScript</w:t>
+      </w:r>
+      <w:proofErr w:type="spellEnd"/>
+    </w:p>
+    <w:p>
+      <w:pPr>
+        <w:spacing w:before="100" w:beforeAutospacing="1" w:after="100" w:afterAutospacing="1" w:line="240" w:lineRule="auto"/>
+        <w:outlineLvl w:val="1"/>
+        <w:rPr>
+          <w:rFonts w:ascii="Arial" w:eastAsia="Times New Roman" w:hAnsi="Arial" w:cs="Arial"/>
+          <w:b/>
+          <w:bCs/>
+          <w:sz w:val="36"/>
+          <w:szCs w:val="36"/>
+          <w:lang w:eastAsia="pt-BR"/>
+        </w:rPr>
+      </w:pPr>
+      <w:r>
+        <w:rPr>
+          <w:rFonts w:ascii="Arial" w:eastAsia="Times New Roman" w:hAnsi="Arial" w:cs="Arial"/>
+          <w:b/>
+          <w:bCs/>
+          <w:sz w:val="36"/>
+          <w:szCs w:val="36"/>
+          <w:lang w:eastAsia="pt-BR"/>
+        </w:rPr>
+        <w:lastRenderedPageBreak/>
+        <w:t>4.2 Banco de Dados</w:t>
       </w:r>
     </w:p>
     <w:p>
@@ -1409,7 +1636,7 @@
           <w:szCs w:val="24"/>
           <w:lang w:eastAsia="pt-BR"/>
         </w:rPr>
-        <w:t>Definir</w:t>
+        <w:t xml:space="preserve">MySQL </w:t>
       </w:r>
     </w:p>
     <w:p>
@@ -1425,11 +1652,7 @@
           <w:lang w:eastAsia="pt-BR"/>
         </w:rPr>
       </w:pPr>
-    </w:p>
-    <w:p>
-      <w:pPr>
-        <w:spacing w:before="100" w:beforeAutospacing="1" w:after="100" w:afterAutospacing="1" w:line="240" w:lineRule="auto"/>
-        <w:outlineLvl w:val="1"/>
+      <w:r>
         <w:rPr>
           <w:rFonts w:ascii="Arial" w:eastAsia="Times New Roman" w:hAnsi="Arial" w:cs="Arial"/>
           <w:b/>
@@ -1438,8 +1661,83 @@
           <w:szCs w:val="36"/>
           <w:lang w:eastAsia="pt-BR"/>
         </w:rPr>
-      </w:pPr>
-      <w:r>
+        <w:t>4.3 Ferramentas de Modelagem</w:t>
+      </w:r>
+    </w:p>
+    <w:p>
+      <w:pPr>
+        <w:numPr>
+          <w:ilvl w:val="0"/>
+          <w:numId w:val="6"/>
+        </w:numPr>
+        <w:spacing w:before="100" w:beforeAutospacing="1" w:after="100" w:afterAutospacing="1" w:line="240" w:lineRule="auto"/>
+        <w:rPr>
+          <w:rFonts w:ascii="Arial" w:eastAsia="Times New Roman" w:hAnsi="Arial" w:cs="Arial"/>
+          <w:sz w:val="24"/>
+          <w:szCs w:val="24"/>
+          <w:lang w:eastAsia="pt-BR"/>
+        </w:rPr>
+      </w:pPr>
+      <w:proofErr w:type="spellStart"/>
+      <w:r>
+        <w:rPr>
+          <w:rFonts w:ascii="Arial" w:eastAsia="Times New Roman" w:hAnsi="Arial" w:cs="Arial"/>
+          <w:sz w:val="24"/>
+          <w:szCs w:val="24"/>
+          <w:lang w:eastAsia="pt-BR"/>
+        </w:rPr>
+        <w:t>Astah</w:t>
+      </w:r>
+      <w:proofErr w:type="spellEnd"/>
+      <w:r>
+        <w:rPr>
+          <w:rFonts w:ascii="Arial" w:eastAsia="Times New Roman" w:hAnsi="Arial" w:cs="Arial"/>
+          <w:sz w:val="24"/>
+          <w:szCs w:val="24"/>
+          <w:lang w:eastAsia="pt-BR"/>
+        </w:rPr>
+        <w:t xml:space="preserve"> UML </w:t>
+      </w:r>
+    </w:p>
+    <w:p>
+      <w:pPr>
+        <w:numPr>
+          <w:ilvl w:val="0"/>
+          <w:numId w:val="6"/>
+        </w:numPr>
+        <w:spacing w:before="100" w:beforeAutospacing="1" w:after="100" w:afterAutospacing="1" w:line="240" w:lineRule="auto"/>
+        <w:rPr>
+          <w:rFonts w:ascii="Times New Roman" w:eastAsia="Times New Roman" w:hAnsi="Times New Roman" w:cs="Times New Roman"/>
+          <w:sz w:val="24"/>
+          <w:szCs w:val="24"/>
+          <w:lang w:eastAsia="pt-BR"/>
+        </w:rPr>
+      </w:pPr>
+      <w:proofErr w:type="spellStart"/>
+      <w:r>
+        <w:rPr>
+          <w:rFonts w:ascii="Arial" w:eastAsia="Times New Roman" w:hAnsi="Arial" w:cs="Arial"/>
+          <w:sz w:val="24"/>
+          <w:szCs w:val="24"/>
+          <w:lang w:eastAsia="pt-BR"/>
+        </w:rPr>
+        <w:t>Canva</w:t>
+      </w:r>
+      <w:proofErr w:type="spellEnd"/>
+      <w:r>
+        <w:rPr>
+          <w:rFonts w:ascii="Times New Roman" w:eastAsia="Times New Roman" w:hAnsi="Times New Roman" w:cs="Times New Roman"/>
+          <w:sz w:val="24"/>
+          <w:szCs w:val="24"/>
+          <w:lang w:eastAsia="pt-BR"/>
+        </w:rPr>
+        <w:t xml:space="preserve"> </w:t>
+      </w:r>
+    </w:p>
+    <w:p>
+      <w:pPr>
+        <w:spacing w:before="100" w:beforeAutospacing="1" w:after="100" w:afterAutospacing="1" w:line="240" w:lineRule="auto"/>
+        <w:outlineLvl w:val="1"/>
         <w:rPr>
           <w:rFonts w:ascii="Arial" w:eastAsia="Times New Roman" w:hAnsi="Arial" w:cs="Arial"/>
           <w:b/>
@@ -1448,38 +1746,8 @@
           <w:szCs w:val="36"/>
           <w:lang w:eastAsia="pt-BR"/>
         </w:rPr>
-        <w:lastRenderedPageBreak/>
-        <w:t>4.2 Banco de Dados</w:t>
-      </w:r>
-    </w:p>
-    <w:p>
-      <w:pPr>
-        <w:numPr>
-          <w:ilvl w:val="0"/>
-          <w:numId w:val="5"/>
-        </w:numPr>
-        <w:spacing w:before="100" w:beforeAutospacing="1" w:after="100" w:afterAutospacing="1" w:line="240" w:lineRule="auto"/>
-        <w:rPr>
-          <w:rFonts w:ascii="Arial" w:eastAsia="Times New Roman" w:hAnsi="Arial" w:cs="Arial"/>
-          <w:sz w:val="24"/>
-          <w:szCs w:val="24"/>
-          <w:lang w:eastAsia="pt-BR"/>
-        </w:rPr>
-      </w:pPr>
-      <w:r>
-        <w:rPr>
-          <w:rFonts w:ascii="Arial" w:eastAsia="Times New Roman" w:hAnsi="Arial" w:cs="Arial"/>
-          <w:sz w:val="24"/>
-          <w:szCs w:val="24"/>
-          <w:lang w:eastAsia="pt-BR"/>
-        </w:rPr>
-        <w:t xml:space="preserve">MySQL </w:t>
-      </w:r>
-    </w:p>
-    <w:p>
-      <w:pPr>
-        <w:spacing w:before="100" w:beforeAutospacing="1" w:after="100" w:afterAutospacing="1" w:line="240" w:lineRule="auto"/>
-        <w:outlineLvl w:val="1"/>
+      </w:pPr>
+      <w:r>
         <w:rPr>
           <w:rFonts w:ascii="Arial" w:eastAsia="Times New Roman" w:hAnsi="Arial" w:cs="Arial"/>
           <w:b/>
@@ -1488,98 +1756,6 @@
           <w:szCs w:val="36"/>
           <w:lang w:eastAsia="pt-BR"/>
         </w:rPr>
-      </w:pPr>
-      <w:r>
-        <w:rPr>
-          <w:rFonts w:ascii="Arial" w:eastAsia="Times New Roman" w:hAnsi="Arial" w:cs="Arial"/>
-          <w:b/>
-          <w:bCs/>
-          <w:sz w:val="36"/>
-          <w:szCs w:val="36"/>
-          <w:lang w:eastAsia="pt-BR"/>
-        </w:rPr>
-        <w:t>4.3 Ferramentas de Modelagem</w:t>
-      </w:r>
-    </w:p>
-    <w:p>
-      <w:pPr>
-        <w:numPr>
-          <w:ilvl w:val="0"/>
-          <w:numId w:val="6"/>
-        </w:numPr>
-        <w:spacing w:before="100" w:beforeAutospacing="1" w:after="100" w:afterAutospacing="1" w:line="240" w:lineRule="auto"/>
-        <w:rPr>
-          <w:rFonts w:ascii="Arial" w:eastAsia="Times New Roman" w:hAnsi="Arial" w:cs="Arial"/>
-          <w:sz w:val="24"/>
-          <w:szCs w:val="24"/>
-          <w:lang w:eastAsia="pt-BR"/>
-        </w:rPr>
-      </w:pPr>
-      <w:r>
-        <w:rPr>
-          <w:rFonts w:ascii="Arial" w:eastAsia="Times New Roman" w:hAnsi="Arial" w:cs="Arial"/>
-          <w:sz w:val="24"/>
-          <w:szCs w:val="24"/>
-          <w:lang w:eastAsia="pt-BR"/>
-        </w:rPr>
-        <w:t xml:space="preserve">Astah UML </w:t>
-      </w:r>
-    </w:p>
-    <w:p>
-      <w:pPr>
-        <w:numPr>
-          <w:ilvl w:val="0"/>
-          <w:numId w:val="6"/>
-        </w:numPr>
-        <w:spacing w:before="100" w:beforeAutospacing="1" w:after="100" w:afterAutospacing="1" w:line="240" w:lineRule="auto"/>
-        <w:rPr>
-          <w:rFonts w:ascii="Times New Roman" w:eastAsia="Times New Roman" w:hAnsi="Times New Roman" w:cs="Times New Roman"/>
-          <w:sz w:val="24"/>
-          <w:szCs w:val="24"/>
-          <w:lang w:eastAsia="pt-BR"/>
-        </w:rPr>
-      </w:pPr>
-      <w:r>
-        <w:rPr>
-          <w:rFonts w:ascii="Arial" w:eastAsia="Times New Roman" w:hAnsi="Arial" w:cs="Arial"/>
-          <w:sz w:val="24"/>
-          <w:szCs w:val="24"/>
-          <w:lang w:eastAsia="pt-BR"/>
-        </w:rPr>
-        <w:t>Canva</w:t>
-      </w:r>
-      <w:r>
-        <w:rPr>
-          <w:rFonts w:ascii="Times New Roman" w:eastAsia="Times New Roman" w:hAnsi="Times New Roman" w:cs="Times New Roman"/>
-          <w:sz w:val="24"/>
-          <w:szCs w:val="24"/>
-          <w:lang w:eastAsia="pt-BR"/>
-        </w:rPr>
-        <w:t xml:space="preserve"> </w:t>
-      </w:r>
-    </w:p>
-    <w:p>
-      <w:pPr>
-        <w:spacing w:before="100" w:beforeAutospacing="1" w:after="100" w:afterAutospacing="1" w:line="240" w:lineRule="auto"/>
-        <w:outlineLvl w:val="1"/>
-        <w:rPr>
-          <w:rFonts w:ascii="Arial" w:eastAsia="Times New Roman" w:hAnsi="Arial" w:cs="Arial"/>
-          <w:b/>
-          <w:bCs/>
-          <w:sz w:val="36"/>
-          <w:szCs w:val="36"/>
-          <w:lang w:eastAsia="pt-BR"/>
-        </w:rPr>
-      </w:pPr>
-      <w:r>
-        <w:rPr>
-          <w:rFonts w:ascii="Arial" w:eastAsia="Times New Roman" w:hAnsi="Arial" w:cs="Arial"/>
-          <w:b/>
-          <w:bCs/>
-          <w:sz w:val="36"/>
-          <w:szCs w:val="36"/>
-          <w:lang w:eastAsia="pt-BR"/>
-        </w:rPr>
         <w:t>4.4 Ferramentas de Organização e Controle</w:t>
       </w:r>
     </w:p>
@@ -1613,7 +1789,47 @@
           <w:szCs w:val="24"/>
           <w:lang w:eastAsia="pt-BR"/>
         </w:rPr>
-        <w:t xml:space="preserve"> (Git Projects)</w:t>
+        <w:t xml:space="preserve"> (</w:t>
+      </w:r>
+      <w:proofErr w:type="spellStart"/>
+      <w:r>
+        <w:rPr>
+          <w:rFonts w:ascii="Arial" w:eastAsia="Times New Roman" w:hAnsi="Arial" w:cs="Arial"/>
+          <w:sz w:val="24"/>
+          <w:szCs w:val="24"/>
+          <w:lang w:eastAsia="pt-BR"/>
+        </w:rPr>
+        <w:t>Git</w:t>
+      </w:r>
+      <w:proofErr w:type="spellEnd"/>
+      <w:r>
+        <w:rPr>
+          <w:rFonts w:ascii="Arial" w:eastAsia="Times New Roman" w:hAnsi="Arial" w:cs="Arial"/>
+          <w:sz w:val="24"/>
+          <w:szCs w:val="24"/>
+          <w:lang w:eastAsia="pt-BR"/>
+        </w:rPr>
+        <w:t xml:space="preserve"> </w:t>
+      </w:r>
+      <w:proofErr w:type="spellStart"/>
+      <w:r>
+        <w:rPr>
+          <w:rFonts w:ascii="Arial" w:eastAsia="Times New Roman" w:hAnsi="Arial" w:cs="Arial"/>
+          <w:sz w:val="24"/>
+          <w:szCs w:val="24"/>
+          <w:lang w:eastAsia="pt-BR"/>
+        </w:rPr>
+        <w:t>Projects</w:t>
+      </w:r>
+      <w:proofErr w:type="spellEnd"/>
+      <w:r>
+        <w:rPr>
+          <w:rFonts w:ascii="Arial" w:eastAsia="Times New Roman" w:hAnsi="Arial" w:cs="Arial"/>
+          <w:sz w:val="24"/>
+          <w:szCs w:val="24"/>
+          <w:lang w:eastAsia="pt-BR"/>
+        </w:rPr>
+        <w:t>)</w:t>
       </w:r>
       <w:r>
         <w:rPr>
@@ -2023,7 +2239,47 @@
           <w:szCs w:val="24"/>
           <w:lang w:eastAsia="pt-BR"/>
         </w:rPr>
-        <w:t>GitHub Projects utilizando metodologia Kanban.</w:t>
+        <w:t xml:space="preserve">GitHub </w:t>
+      </w:r>
+      <w:proofErr w:type="spellStart"/>
+      <w:r>
+        <w:rPr>
+          <w:rFonts w:ascii="Arial" w:eastAsia="Times New Roman" w:hAnsi="Arial" w:cs="Arial"/>
+          <w:sz w:val="24"/>
+          <w:szCs w:val="24"/>
+          <w:lang w:eastAsia="pt-BR"/>
+        </w:rPr>
+        <w:t>Projects</w:t>
+      </w:r>
+      <w:proofErr w:type="spellEnd"/>
+      <w:r>
+        <w:rPr>
+          <w:rFonts w:ascii="Arial" w:eastAsia="Times New Roman" w:hAnsi="Arial" w:cs="Arial"/>
+          <w:sz w:val="24"/>
+          <w:szCs w:val="24"/>
+          <w:lang w:eastAsia="pt-BR"/>
+        </w:rPr>
+        <w:t xml:space="preserve"> utilizando metodologia </w:t>
+      </w:r>
+      <w:proofErr w:type="spellStart"/>
+      <w:r>
+        <w:rPr>
+          <w:rFonts w:ascii="Arial" w:eastAsia="Times New Roman" w:hAnsi="Arial" w:cs="Arial"/>
+          <w:sz w:val="24"/>
+          <w:szCs w:val="24"/>
+          <w:lang w:eastAsia="pt-BR"/>
+        </w:rPr>
+        <w:t>Kanban</w:t>
+      </w:r>
+      <w:proofErr w:type="spellEnd"/>
+      <w:r>
+        <w:rPr>
+          <w:rFonts w:ascii="Arial" w:eastAsia="Times New Roman" w:hAnsi="Arial" w:cs="Arial"/>
+          <w:sz w:val="24"/>
+          <w:szCs w:val="24"/>
+          <w:lang w:eastAsia="pt-BR"/>
+        </w:rPr>
+        <w:t>.</w:t>
       </w:r>
     </w:p>
     <w:p>
@@ -2045,17 +2301,7 @@
           <w:sz w:val="48"/>
           <w:szCs w:val="48"/>
         </w:rPr>
-        <w:t xml:space="preserve">6. </w:t>
-      </w:r>
-      <w:r>
-        <w:rPr>
-          <w:rFonts w:ascii="Arial" w:hAnsi="Arial" w:cs="Arial"/>
-          <w:b/>
-          <w:bCs/>
-          <w:sz w:val="48"/>
-          <w:szCs w:val="48"/>
-        </w:rPr>
-        <w:t>Trabalho em Equipe</w:t>
+        <w:t>6. Trabalho em Equipe</w:t>
       </w:r>
     </w:p>
     <w:p>
@@ -2538,6 +2784,119 @@
     </w:lvl>
   </w:abstractNum>
   <w:abstractNum w:abstractNumId="3" w15:restartNumberingAfterBreak="0">
+    <w:nsid w:val="0A24399D"/>
+    <w:multiLevelType w:val="hybridMultilevel"/>
+    <w:tmpl w:val="27B22600"/>
+    <w:lvl w:ilvl="0" w:tplc="04160001">
+      <w:start w:val="1"/>
+      <w:numFmt w:val="bullet"/>
+      <w:lvlText w:val=""/>
+      <w:lvlJc w:val="left"/>
+      <w:pPr>
+        <w:ind w:left="720" w:hanging="360"/>
+      </w:pPr>
+      <w:rPr>
+        <w:rFonts w:ascii="Symbol" w:hAnsi="Symbol" w:hint="default"/>
+      </w:rPr>
+    </w:lvl>
+    <w:lvl w:ilvl="1" w:tplc="04160003" w:tentative="1">
+      <w:start w:val="1"/>
+      <w:numFmt w:val="bullet"/>
+      <w:lvlText w:val="o"/>
+      <w:lvlJc w:val="left"/>
+      <w:pPr>
+        <w:ind w:left="1440" w:hanging="360"/>
+      </w:pPr>
+      <w:rPr>
+        <w:rFonts w:ascii="Courier New" w:hAnsi="Courier New" w:cs="Courier New" w:hint="default"/>
+      </w:rPr>
+    </w:lvl>
+    <w:lvl w:ilvl="2" w:tplc="04160005" w:tentative="1">
+      <w:start w:val="1"/>
+      <w:numFmt w:val="bullet"/>
+      <w:lvlText w:val=""/>
+      <w:lvlJc w:val="left"/>
+      <w:pPr>
+        <w:ind w:left="2160" w:hanging="360"/>
+      </w:pPr>
+      <w:rPr>
+        <w:rFonts w:ascii="Wingdings" w:hAnsi="Wingdings" w:hint="default"/>
+      </w:rPr>
+    </w:lvl>
+    <w:lvl w:ilvl="3" w:tplc="04160001" w:tentative="1">
+      <w:start w:val="1"/>
+      <w:numFmt w:val="bullet"/>
+      <w:lvlText w:val=""/>
+      <w:lvlJc w:val="left"/>
+      <w:pPr>
+        <w:ind w:left="2880" w:hanging="360"/>
+      </w:pPr>
+      <w:rPr>
+        <w:rFonts w:ascii="Symbol" w:hAnsi="Symbol" w:hint="default"/>
+      </w:rPr>
+    </w:lvl>
+    <w:lvl w:ilvl="4" w:tplc="04160003" w:tentative="1">
+      <w:start w:val="1"/>
+      <w:numFmt w:val="bullet"/>
+      <w:lvlText w:val="o"/>
+      <w:lvlJc w:val="left"/>
+      <w:pPr>
+        <w:ind w:left="3600" w:hanging="360"/>
+      </w:pPr>
+      <w:rPr>
+        <w:rFonts w:ascii="Courier New" w:hAnsi="Courier New" w:cs="Courier New" w:hint="default"/>
+      </w:rPr>
+    </w:lvl>
+    <w:lvl w:ilvl="5" w:tplc="04160005" w:tentative="1">
+      <w:start w:val="1"/>
+      <w:numFmt w:val="bullet"/>
+      <w:lvlText w:val=""/>
+      <w:lvlJc w:val="left"/>
+      <w:pPr>
+        <w:ind w:left="4320" w:hanging="360"/>
+      </w:pPr>
+      <w:rPr>
+        <w:rFonts w:ascii="Wingdings" w:hAnsi="Wingdings" w:hint="default"/>
+      </w:rPr>
+    </w:lvl>
+    <w:lvl w:ilvl="6" w:tplc="04160001" w:tentative="1">
+      <w:start w:val="1"/>
+      <w:numFmt w:val="bullet"/>
+      <w:lvlText w:val=""/>
+      <w:lvlJc w:val="left"/>
+      <w:pPr>
+        <w:ind w:left="5040" w:hanging="360"/>
+      </w:pPr>
+      <w:rPr>
+        <w:rFonts w:ascii="Symbol" w:hAnsi="Symbol" w:hint="default"/>
+      </w:rPr>
+    </w:lvl>
+    <w:lvl w:ilvl="7" w:tplc="04160003" w:tentative="1">
+      <w:start w:val="1"/>
+      <w:numFmt w:val="bullet"/>
+      <w:lvlText w:val="o"/>
+      <w:lvlJc w:val="left"/>
+      <w:pPr>
+        <w:ind w:left="5760" w:hanging="360"/>
+      </w:pPr>
+      <w:rPr>
+        <w:rFonts w:ascii="Courier New" w:hAnsi="Courier New" w:cs="Courier New" w:hint="default"/>
+      </w:rPr>
+    </w:lvl>
+    <w:lvl w:ilvl="8" w:tplc="04160005" w:tentative="1">
+      <w:start w:val="1"/>
+      <w:numFmt w:val="bullet"/>
+      <w:lvlText w:val=""/>
+      <w:lvlJc w:val="left"/>
+      <w:pPr>
+        <w:ind w:left="6480" w:hanging="360"/>
+      </w:pPr>
+      <w:rPr>
+        <w:rFonts w:ascii="Wingdings" w:hAnsi="Wingdings" w:hint="default"/>
+      </w:rPr>
+    </w:lvl>
+  </w:abstractNum>
+  <w:abstractNum w:abstractNumId="4" w15:restartNumberingAfterBreak="0">
     <w:nsid w:val="159D4B23"/>
     <w:multiLevelType w:val="multilevel"/>
     <w:tmpl w:val="65247668"/>
@@ -2686,7 +3045,7 @@
       </w:rPr>
     </w:lvl>
   </w:abstractNum>
-  <w:abstractNum w:abstractNumId="4" w15:restartNumberingAfterBreak="0">
+  <w:abstractNum w:abstractNumId="5" w15:restartNumberingAfterBreak="0">
     <w:nsid w:val="1CE24CF1"/>
     <w:multiLevelType w:val="multilevel"/>
     <w:tmpl w:val="F322FBF8"/>
@@ -2835,7 +3194,7 @@
       </w:rPr>
     </w:lvl>
   </w:abstractNum>
-  <w:abstractNum w:abstractNumId="5" w15:restartNumberingAfterBreak="0">
+  <w:abstractNum w:abstractNumId="6" w15:restartNumberingAfterBreak="0">
     <w:nsid w:val="23954EE7"/>
     <w:multiLevelType w:val="multilevel"/>
     <w:tmpl w:val="5E0C6568"/>
@@ -2984,7 +3343,7 @@
       </w:rPr>
     </w:lvl>
   </w:abstractNum>
-  <w:abstractNum w:abstractNumId="6" w15:restartNumberingAfterBreak="0">
+  <w:abstractNum w:abstractNumId="7" w15:restartNumberingAfterBreak="0">
     <w:nsid w:val="39F52BA9"/>
     <w:multiLevelType w:val="multilevel"/>
     <w:tmpl w:val="4F4C7396"/>
@@ -3133,7 +3492,7 @@
       </w:rPr>
     </w:lvl>
   </w:abstractNum>
-  <w:abstractNum w:abstractNumId="7" w15:restartNumberingAfterBreak="0">
+  <w:abstractNum w:abstractNumId="8" w15:restartNumberingAfterBreak="0">
     <w:nsid w:val="63CF49C5"/>
     <w:multiLevelType w:val="multilevel"/>
     <w:tmpl w:val="BBE60884"/>
@@ -3282,7 +3641,7 @@
       </w:rPr>
     </w:lvl>
   </w:abstractNum>
-  <w:abstractNum w:abstractNumId="8" w15:restartNumberingAfterBreak="0">
+  <w:abstractNum w:abstractNumId="9" w15:restartNumberingAfterBreak="0">
     <w:nsid w:val="69286254"/>
     <w:multiLevelType w:val="multilevel"/>
     <w:tmpl w:val="13C4840E"/>
@@ -3431,7 +3790,7 @@
       </w:rPr>
     </w:lvl>
   </w:abstractNum>
-  <w:abstractNum w:abstractNumId="9" w15:restartNumberingAfterBreak="0">
+  <w:abstractNum w:abstractNumId="10" w15:restartNumberingAfterBreak="0">
     <w:nsid w:val="6C315582"/>
     <w:multiLevelType w:val="multilevel"/>
     <w:tmpl w:val="2972673E"/>
@@ -3581,34 +3940,37 @@
     </w:lvl>
   </w:abstractNum>
   <w:num w:numId="1">
-    <w:abstractNumId w:val="5"/>
+    <w:abstractNumId w:val="6"/>
   </w:num>
   <w:num w:numId="2">
-    <w:abstractNumId w:val="7"/>
+    <w:abstractNumId w:val="8"/>
   </w:num>
   <w:num w:numId="3">
     <w:abstractNumId w:val="0"/>
   </w:num>
   <w:num w:numId="4">
-    <w:abstractNumId w:val="8"/>
+    <w:abstractNumId w:val="9"/>
   </w:num>
   <w:num w:numId="5">
-    <w:abstractNumId w:val="6"/>
+    <w:abstractNumId w:val="7"/>
   </w:num>
   <w:num w:numId="6">
-    <w:abstractNumId w:val="9"/>
+    <w:abstractNumId w:val="10"/>
   </w:num>
   <w:num w:numId="7">
-    <w:abstractNumId w:val="3"/>
+    <w:abstractNumId w:val="4"/>
   </w:num>
   <w:num w:numId="8">
     <w:abstractNumId w:val="1"/>
   </w:num>
   <w:num w:numId="9">
-    <w:abstractNumId w:val="4"/>
+    <w:abstractNumId w:val="5"/>
   </w:num>
   <w:num w:numId="10">
     <w:abstractNumId w:val="2"/>
+  </w:num>
+  <w:num w:numId="11">
+    <w:abstractNumId w:val="3"/>
   </w:num>
 </w:numbering>
 </file>
@@ -4198,6 +4560,17 @@
       <w:szCs w:val="56"/>
     </w:rPr>
   </w:style>
+  <w:style w:type="paragraph" w:styleId="PargrafodaLista">
+    <w:name w:val="List Paragraph"/>
+    <w:basedOn w:val="Normal"/>
+    <w:uiPriority w:val="34"/>
+    <w:qFormat/>
+    <w:rsid w:val="00340794"/>
+    <w:pPr>
+      <w:ind w:left="720"/>
+      <w:contextualSpacing/>
+    </w:pPr>
+  </w:style>
 </w:styles>
 </file>
 

</xml_diff>